<commit_message>
Finished the assignment for D602
</commit_message>
<xml_diff>
--- a/D602/Task 2/D602  Task 2.docx
+++ b/D602/Task 2/D602  Task 2.docx
@@ -446,7 +446,38 @@
     </w:p>
     <w:p>
       <w:r>
-        <w:t xml:space="preserve">For this part of the project I created a main script file that will serve as a single entry point for executing all three stages of the flight delay prediction pipeline in a sequence. </w:t>
+        <w:t xml:space="preserve">For this part of the </w:t>
+      </w:r>
+      <w:r>
+        <w:t>project,</w:t>
+      </w:r>
+      <w:r>
+        <w:t xml:space="preserve"> I created a main script file that will serve as a </w:t>
+      </w:r>
+      <w:r>
+        <w:t>single-entry</w:t>
+      </w:r>
+      <w:r>
+        <w:t xml:space="preserve"> point for executing all three stages of the flight delay prediction pipeline in a sequence.</w:t>
+      </w:r>
+      <w:r>
+        <w:t xml:space="preserve"> Instead of running each script individually, the main script just calls the import, clean, and train scripts as subprocesses in the correct order, halting execution and reporting error if any of the steps fail. </w:t>
+      </w:r>
+    </w:p>
+    <w:p>
+      <w:r>
+        <w:t xml:space="preserve">For version 1 I created a helper function that accepts the script name and description, executes the script using the current python interpreter, and logs the outcome to main_pipeline.log. If the subprocess returns a non-zero exit code, the error message is written to the log and the pipeline halts immediately. </w:t>
+      </w:r>
+    </w:p>
+    <w:p>
+      <w:r>
+        <w:t xml:space="preserve">For version 2, I introduced </w:t>
+      </w:r>
+      <w:r>
+        <w:t xml:space="preserve">three enhancements to the version 1 file. First, I used argparse to expose the num_alphas and order model training parameters as optional command-line arguments, this allows other analysts to customize the training run without modifying the source code. Second, each step is timed using Python’s time module, and the elapsed duration is both logged and printed at the end of the run in a summary table. Lastly, </w:t>
+      </w:r>
+      <w:r>
+        <w:t xml:space="preserve">stdout and stderr output from each subprocess are separated in the log file, making it easier to diagnose failures. </w:t>
       </w:r>
     </w:p>
     <w:p>
@@ -456,6 +487,31 @@
     </w:p>
     <w:p>
       <w:r>
+        <w:t xml:space="preserve">The MLProject file includes four entry points that correspond to each stage of the pipeline. </w:t>
+      </w:r>
+      <w:r>
+        <w:t xml:space="preserve">The main entry point will execute the main_v2 python file with the num_alphas and order parameters, enabling the complete pipeline to be used in a single </w:t>
+      </w:r>
+      <w:proofErr w:type="spellStart"/>
+      <w:r>
+        <w:t>mlflow</w:t>
+      </w:r>
+      <w:proofErr w:type="spellEnd"/>
+      <w:r>
+        <w:t xml:space="preserve"> command. For the entry points, the first one importing and formatting entry point executes the import data python file, that will load and format the data. The cleaning entry point executes the clean data python file, which applies all the cleaning methods used. Then, the train model entry point executes the </w:t>
+      </w:r>
+      <w:proofErr w:type="spellStart"/>
+      <w:r>
+        <w:t>polyregressor</w:t>
+      </w:r>
+      <w:proofErr w:type="spellEnd"/>
+      <w:r>
+        <w:t xml:space="preserve"> file directly with the num_alphas and order parameters for cases where only the model training step needs to be re-run. </w:t>
+      </w:r>
+    </w:p>
+    <w:p>
+      <w:r>
+        <w:lastRenderedPageBreak/>
         <w:t xml:space="preserve">Part </w:t>
       </w:r>
       <w:r>
@@ -609,7 +665,6 @@
     <w:p/>
     <w:p>
       <w:r>
-        <w:lastRenderedPageBreak/>
         <w:t>DVC. (n.d.). Data Version control documentation. https;</w:t>
       </w:r>
       <w:r>
@@ -2289,18 +2344,18 @@
 </file>
 
 <file path=customXml/item2.xml><?xml version="1.0" encoding="utf-8"?>
+<p:properties xmlns:p="http://schemas.microsoft.com/office/2006/metadata/properties" xmlns:xsi="http://www.w3.org/2001/XMLSchema-instance" xmlns:pc="http://schemas.microsoft.com/office/infopath/2007/PartnerControls">
+  <documentManagement/>
+</p:properties>
+</file>
+
+<file path=customXml/item3.xml><?xml version="1.0" encoding="utf-8"?>
 <?mso-contentType ?>
 <FormTemplates xmlns="http://schemas.microsoft.com/sharepoint/v3/contenttype/forms">
   <Display>DocumentLibraryForm</Display>
   <Edit>DocumentLibraryForm</Edit>
   <New>DocumentLibraryForm</New>
 </FormTemplates>
-</file>
-
-<file path=customXml/item3.xml><?xml version="1.0" encoding="utf-8"?>
-<p:properties xmlns:p="http://schemas.microsoft.com/office/2006/metadata/properties" xmlns:xsi="http://www.w3.org/2001/XMLSchema-instance" xmlns:pc="http://schemas.microsoft.com/office/infopath/2007/PartnerControls">
-  <documentManagement/>
-</p:properties>
 </file>
 
 <file path=customXml/itemProps1.xml><?xml version="1.0" encoding="utf-8"?>
@@ -2322,18 +2377,18 @@
 </file>
 
 <file path=customXml/itemProps2.xml><?xml version="1.0" encoding="utf-8"?>
-<ds:datastoreItem xmlns:ds="http://schemas.openxmlformats.org/officeDocument/2006/customXml" ds:itemID="{A97A5CBF-20DD-4EEC-81A6-A2E49C4A7AB8}">
-  <ds:schemaRefs>
-    <ds:schemaRef ds:uri="http://schemas.microsoft.com/sharepoint/v3/contenttype/forms"/>
-  </ds:schemaRefs>
-</ds:datastoreItem>
-</file>
-
-<file path=customXml/itemProps3.xml><?xml version="1.0" encoding="utf-8"?>
 <ds:datastoreItem xmlns:ds="http://schemas.openxmlformats.org/officeDocument/2006/customXml" ds:itemID="{1454A9DC-6C50-4167-9822-6F8E0E7D581B}">
   <ds:schemaRefs>
     <ds:schemaRef ds:uri="http://schemas.microsoft.com/office/2006/metadata/properties"/>
     <ds:schemaRef ds:uri="http://schemas.microsoft.com/office/infopath/2007/PartnerControls"/>
   </ds:schemaRefs>
 </ds:datastoreItem>
+</file>
+
+<file path=customXml/itemProps3.xml><?xml version="1.0" encoding="utf-8"?>
+<ds:datastoreItem xmlns:ds="http://schemas.openxmlformats.org/officeDocument/2006/customXml" ds:itemID="{A97A5CBF-20DD-4EEC-81A6-A2E49C4A7AB8}">
+  <ds:schemaRefs>
+    <ds:schemaRef ds:uri="http://schemas.microsoft.com/sharepoint/v3/contenttype/forms"/>
+  </ds:schemaRefs>
+</ds:datastoreItem>
 </file>
</xml_diff>